<commit_message>
Fix table title from Tabell 1 to Tabell 4 in baseline docx
Co-Authored-By: Claude Sonnet 4.6 <noreply@anthropic.com>
</commit_message>
<xml_diff>
--- a/output/tables/tabell4_baseline.docx
+++ b/output/tables/tabell4_baseline.docx
@@ -25,7 +25,7 @@
           <w:szCs w:val="20"/>
           <w:color w:val="000000"/>
         </w:rPr>
-        <w:t xml:space="preserve">Tabell 1. Baseline-karakteristikker fordelt på gruppe</w:t>
+        <w:t xml:space="preserve">Tabell 4. Baseline-karakteristikker fordelt på gruppe</w:t>
       </w:r>
     </w:p>
     <w:tbl xmlns:a="http://schemas.openxmlformats.org/drawingml/2006/main" xmlns:pic="http://schemas.openxmlformats.org/drawingml/2006/picture">
@@ -1235,7 +1235,7 @@
                 <w:szCs w:val="20"/>
                 <w:color w:val="000000"/>
               </w:rPr>
-              <w:t xml:space="preserve">0.006</w:t>
+              <w:t xml:space="preserve">0.007</w:t>
             </w:r>
           </w:p>
         </w:tc>
@@ -2635,7 +2635,7 @@
                 <w:szCs w:val="20"/>
                 <w:color w:val="000000"/>
               </w:rPr>
-              <w:t xml:space="preserve">0.575</w:t>
+              <w:t xml:space="preserve">0.571</w:t>
             </w:r>
           </w:p>
         </w:tc>

</xml_diff>

<commit_message>
Remove DXA section from n=70 baseline table (incomplete data for all 70)
Co-Authored-By: Claude Sonnet 4.6 <noreply@anthropic.com>
</commit_message>
<xml_diff>
--- a/output/tables/tabell4_baseline.docx
+++ b/output/tables/tabell4_baseline.docx
@@ -1235,7 +1235,7 @@
                 <w:szCs w:val="20"/>
                 <w:color w:val="000000"/>
               </w:rPr>
-              <w:t xml:space="preserve">0.040</w:t>
+              <w:t xml:space="preserve">0.043</w:t>
             </w:r>
           </w:p>
         </w:tc>
@@ -2635,7 +2635,7 @@
                 <w:szCs w:val="20"/>
                 <w:color w:val="000000"/>
               </w:rPr>
-              <w:t xml:space="preserve">0.487</w:t>
+              <w:t xml:space="preserve">0.481</w:t>
             </w:r>
           </w:p>
         </w:tc>
@@ -10791,7 +10791,7 @@
                 <w:left w:val="none" w:sz="0" w:space="0" w:color="000000"/>
                 <w:right w:val="none" w:sz="0" w:space="0" w:color="000000"/>
               </w:pBdr>
-              <w:spacing w:after="40" w:before="40" w:line="240"/>
+              <w:spacing w:after="200" w:before="40" w:line="240"/>
               <w:ind w:left="100" w:right="100" w:firstLine="0" w:firstLineChars="0"/>
               <w:rPr>
                 <w:rFonts w:ascii="Times New Roman" w:hAnsi="Times New Roman" w:eastAsia="Times New Roman" w:cs="Times New Roman"/>
@@ -10846,7 +10846,7 @@
                 <w:left w:val="none" w:sz="0" w:space="0" w:color="000000"/>
                 <w:right w:val="none" w:sz="0" w:space="0" w:color="000000"/>
               </w:pBdr>
-              <w:spacing w:after="40" w:before="40" w:line="240"/>
+              <w:spacing w:after="200" w:before="40" w:line="240"/>
               <w:ind w:left="100" w:right="100" w:firstLine="0" w:firstLineChars="0"/>
               <w:rPr>
                 <w:rFonts w:ascii="Times New Roman" w:hAnsi="Times New Roman" w:eastAsia="Times New Roman" w:cs="Times New Roman"/>
@@ -10901,7 +10901,7 @@
                 <w:left w:val="none" w:sz="0" w:space="0" w:color="000000"/>
                 <w:right w:val="none" w:sz="0" w:space="0" w:color="000000"/>
               </w:pBdr>
-              <w:spacing w:after="40" w:before="40" w:line="240"/>
+              <w:spacing w:after="200" w:before="40" w:line="240"/>
               <w:ind w:left="100" w:right="100" w:firstLine="0" w:firstLineChars="0"/>
               <w:rPr>
                 <w:rFonts w:ascii="Times New Roman" w:hAnsi="Times New Roman" w:eastAsia="Times New Roman" w:cs="Times New Roman"/>
@@ -10956,7 +10956,7 @@
                 <w:left w:val="none" w:sz="0" w:space="0" w:color="000000"/>
                 <w:right w:val="none" w:sz="0" w:space="0" w:color="000000"/>
               </w:pBdr>
-              <w:spacing w:after="40" w:before="40" w:line="240"/>
+              <w:spacing w:after="200" w:before="40" w:line="240"/>
               <w:ind w:left="100" w:right="100" w:firstLine="0" w:firstLineChars="0"/>
               <w:rPr>
                 <w:rFonts w:ascii="Times New Roman" w:hAnsi="Times New Roman" w:eastAsia="Times New Roman" w:cs="Times New Roman"/>
@@ -11011,7 +11011,7 @@
                 <w:left w:val="none" w:sz="0" w:space="0" w:color="000000"/>
                 <w:right w:val="none" w:sz="0" w:space="0" w:color="000000"/>
               </w:pBdr>
-              <w:spacing w:after="40" w:before="40" w:line="240"/>
+              <w:spacing w:after="200" w:before="40" w:line="240"/>
               <w:ind w:left="100" w:right="100" w:firstLine="0" w:firstLineChars="0"/>
               <w:rPr>
                 <w:rFonts w:ascii="Times New Roman" w:hAnsi="Times New Roman" w:eastAsia="Times New Roman" w:cs="Times New Roman"/>
@@ -11036,1126 +11036,6 @@
                 <w:color w:val="000000"/>
               </w:rPr>
               <w:t xml:space="preserve">0.090</w:t>
-            </w:r>
-          </w:p>
-        </w:tc>
-      </w:tr>
-      <w:tr>
-        <w:trPr>
-          <w:trHeight w:val="360" w:hRule="auto"/>
-        </w:trPr>
-        <w:tc>
-          <w:tcPr>
-            <w:tcBorders>
-              <w:bottom w:val="none" w:sz="0" w:space="0" w:color="000000"/>
-              <w:top w:val="single" w:sz="4" w:space="0" w:color="999999"/>
-              <w:left w:val="none" w:sz="0" w:space="0" w:color="000000"/>
-              <w:right w:val="none" w:sz="0" w:space="0" w:color="000000"/>
-            </w:tcBorders>
-            <w:shd w:val="clear" w:color="auto" w:fill="FFFFFF"/>
-            <w:tcMar>
-              <w:top w:w="0" w:type="dxa"/>
-              <w:bottom w:w="0" w:type="dxa"/>
-              <w:left w:w="0" w:type="dxa"/>
-              <w:right w:w="0" w:type="dxa"/>
-            </w:tcMar>
-            <w:vAlign w:val="center"/>
-          </w:tcPr>
-          <w:p>
-            <w:pPr>
-              <w:pStyle w:val="Normal"/>
-              <w:jc w:val="left"/>
-              <w:pBdr>
-                <w:bottom w:val="none" w:sz="0" w:space="0" w:color="000000"/>
-                <w:top w:val="none" w:sz="0" w:space="0" w:color="000000"/>
-                <w:left w:val="none" w:sz="0" w:space="0" w:color="000000"/>
-                <w:right w:val="none" w:sz="0" w:space="0" w:color="000000"/>
-              </w:pBdr>
-              <w:spacing w:after="40" w:before="40" w:line="240"/>
-              <w:ind w:left="100" w:right="100" w:firstLine="0" w:firstLineChars="0"/>
-              <w:rPr>
-                <w:rFonts w:ascii="Times New Roman" w:hAnsi="Times New Roman" w:eastAsia="Times New Roman" w:cs="Times New Roman"/>
-                <w:i w:val="false"/>
-                <w:b w:val="true"/>
-                <w:u w:val="none"/>
-                <w:strike w:val="false"/>
-                <w:sz w:val="20"/>
-                <w:szCs w:val="20"/>
-                <w:color w:val="000000"/>
-              </w:rPr>
-            </w:pPr>
-            <w:r>
-              <w:rPr>
-                <w:rFonts w:ascii="Times New Roman" w:hAnsi="Times New Roman" w:eastAsia="Times New Roman" w:cs="Times New Roman"/>
-                <w:i w:val="false"/>
-                <w:b w:val="true"/>
-                <w:u w:val="none"/>
-                <w:strike w:val="false"/>
-                <w:sz w:val="20"/>
-                <w:szCs w:val="20"/>
-                <w:color w:val="000000"/>
-              </w:rPr>
-              <w:t xml:space="preserve">DXA-målinger (pre), gj.snitt (SD)</w:t>
-            </w:r>
-          </w:p>
-        </w:tc>
-        <w:tc>
-          <w:tcPr>
-            <w:tcBorders>
-              <w:bottom w:val="none" w:sz="0" w:space="0" w:color="000000"/>
-              <w:top w:val="single" w:sz="4" w:space="0" w:color="999999"/>
-              <w:left w:val="none" w:sz="0" w:space="0" w:color="000000"/>
-              <w:right w:val="none" w:sz="0" w:space="0" w:color="000000"/>
-            </w:tcBorders>
-            <w:shd w:val="clear" w:color="auto" w:fill="FFFFFF"/>
-            <w:tcMar>
-              <w:top w:w="0" w:type="dxa"/>
-              <w:bottom w:w="0" w:type="dxa"/>
-              <w:left w:w="0" w:type="dxa"/>
-              <w:right w:w="0" w:type="dxa"/>
-            </w:tcMar>
-            <w:vAlign w:val="center"/>
-          </w:tcPr>
-          <w:p>
-            <w:pPr>
-              <w:pStyle w:val="Normal"/>
-              <w:jc w:val="center"/>
-              <w:pBdr>
-                <w:bottom w:val="none" w:sz="0" w:space="0" w:color="000000"/>
-                <w:top w:val="none" w:sz="0" w:space="0" w:color="000000"/>
-                <w:left w:val="none" w:sz="0" w:space="0" w:color="000000"/>
-                <w:right w:val="none" w:sz="0" w:space="0" w:color="000000"/>
-              </w:pBdr>
-              <w:spacing w:after="40" w:before="40" w:line="240"/>
-              <w:ind w:left="100" w:right="100" w:firstLine="0" w:firstLineChars="0"/>
-              <w:rPr>
-                <w:rFonts w:ascii="Times New Roman" w:hAnsi="Times New Roman" w:eastAsia="Times New Roman" w:cs="Times New Roman"/>
-                <w:i w:val="false"/>
-                <w:b w:val="true"/>
-                <w:u w:val="none"/>
-                <w:strike w:val="false"/>
-                <w:sz w:val="20"/>
-                <w:szCs w:val="20"/>
-                <w:color w:val="000000"/>
-              </w:rPr>
-            </w:pPr>
-            <w:r>
-              <w:rPr>
-                <w:rFonts w:ascii="Times New Roman" w:hAnsi="Times New Roman" w:eastAsia="Times New Roman" w:cs="Times New Roman"/>
-                <w:i w:val="false"/>
-                <w:b w:val="true"/>
-                <w:u w:val="none"/>
-                <w:strike w:val="false"/>
-                <w:sz w:val="20"/>
-                <w:szCs w:val="20"/>
-                <w:color w:val="000000"/>
-              </w:rPr>
-              <w:t xml:space="preserve"/>
-            </w:r>
-          </w:p>
-        </w:tc>
-        <w:tc>
-          <w:tcPr>
-            <w:tcBorders>
-              <w:bottom w:val="none" w:sz="0" w:space="0" w:color="000000"/>
-              <w:top w:val="single" w:sz="4" w:space="0" w:color="999999"/>
-              <w:left w:val="none" w:sz="0" w:space="0" w:color="000000"/>
-              <w:right w:val="none" w:sz="0" w:space="0" w:color="000000"/>
-            </w:tcBorders>
-            <w:shd w:val="clear" w:color="auto" w:fill="FFFFFF"/>
-            <w:tcMar>
-              <w:top w:w="0" w:type="dxa"/>
-              <w:bottom w:w="0" w:type="dxa"/>
-              <w:left w:w="0" w:type="dxa"/>
-              <w:right w:w="0" w:type="dxa"/>
-            </w:tcMar>
-            <w:vAlign w:val="center"/>
-          </w:tcPr>
-          <w:p>
-            <w:pPr>
-              <w:pStyle w:val="Normal"/>
-              <w:jc w:val="center"/>
-              <w:pBdr>
-                <w:bottom w:val="none" w:sz="0" w:space="0" w:color="000000"/>
-                <w:top w:val="none" w:sz="0" w:space="0" w:color="000000"/>
-                <w:left w:val="none" w:sz="0" w:space="0" w:color="000000"/>
-                <w:right w:val="none" w:sz="0" w:space="0" w:color="000000"/>
-              </w:pBdr>
-              <w:spacing w:after="40" w:before="40" w:line="240"/>
-              <w:ind w:left="100" w:right="100" w:firstLine="0" w:firstLineChars="0"/>
-              <w:rPr>
-                <w:rFonts w:ascii="Times New Roman" w:hAnsi="Times New Roman" w:eastAsia="Times New Roman" w:cs="Times New Roman"/>
-                <w:i w:val="false"/>
-                <w:b w:val="true"/>
-                <w:u w:val="none"/>
-                <w:strike w:val="false"/>
-                <w:sz w:val="20"/>
-                <w:szCs w:val="20"/>
-                <w:color w:val="000000"/>
-              </w:rPr>
-            </w:pPr>
-            <w:r>
-              <w:rPr>
-                <w:rFonts w:ascii="Times New Roman" w:hAnsi="Times New Roman" w:eastAsia="Times New Roman" w:cs="Times New Roman"/>
-                <w:i w:val="false"/>
-                <w:b w:val="true"/>
-                <w:u w:val="none"/>
-                <w:strike w:val="false"/>
-                <w:sz w:val="20"/>
-                <w:szCs w:val="20"/>
-                <w:color w:val="000000"/>
-              </w:rPr>
-              <w:t xml:space="preserve"/>
-            </w:r>
-          </w:p>
-        </w:tc>
-        <w:tc>
-          <w:tcPr>
-            <w:tcBorders>
-              <w:bottom w:val="none" w:sz="0" w:space="0" w:color="000000"/>
-              <w:top w:val="single" w:sz="4" w:space="0" w:color="999999"/>
-              <w:left w:val="none" w:sz="0" w:space="0" w:color="000000"/>
-              <w:right w:val="none" w:sz="0" w:space="0" w:color="000000"/>
-            </w:tcBorders>
-            <w:shd w:val="clear" w:color="auto" w:fill="FFFFFF"/>
-            <w:tcMar>
-              <w:top w:w="0" w:type="dxa"/>
-              <w:bottom w:w="0" w:type="dxa"/>
-              <w:left w:w="0" w:type="dxa"/>
-              <w:right w:w="0" w:type="dxa"/>
-            </w:tcMar>
-            <w:vAlign w:val="center"/>
-          </w:tcPr>
-          <w:p>
-            <w:pPr>
-              <w:pStyle w:val="Normal"/>
-              <w:jc w:val="center"/>
-              <w:pBdr>
-                <w:bottom w:val="none" w:sz="0" w:space="0" w:color="000000"/>
-                <w:top w:val="none" w:sz="0" w:space="0" w:color="000000"/>
-                <w:left w:val="none" w:sz="0" w:space="0" w:color="000000"/>
-                <w:right w:val="none" w:sz="0" w:space="0" w:color="000000"/>
-              </w:pBdr>
-              <w:spacing w:after="40" w:before="40" w:line="240"/>
-              <w:ind w:left="100" w:right="100" w:firstLine="0" w:firstLineChars="0"/>
-              <w:rPr>
-                <w:rFonts w:ascii="Times New Roman" w:hAnsi="Times New Roman" w:eastAsia="Times New Roman" w:cs="Times New Roman"/>
-                <w:i w:val="false"/>
-                <w:b w:val="true"/>
-                <w:u w:val="none"/>
-                <w:strike w:val="false"/>
-                <w:sz w:val="20"/>
-                <w:szCs w:val="20"/>
-                <w:color w:val="000000"/>
-              </w:rPr>
-            </w:pPr>
-            <w:r>
-              <w:rPr>
-                <w:rFonts w:ascii="Times New Roman" w:hAnsi="Times New Roman" w:eastAsia="Times New Roman" w:cs="Times New Roman"/>
-                <w:i w:val="false"/>
-                <w:b w:val="true"/>
-                <w:u w:val="none"/>
-                <w:strike w:val="false"/>
-                <w:sz w:val="20"/>
-                <w:szCs w:val="20"/>
-                <w:color w:val="000000"/>
-              </w:rPr>
-              <w:t xml:space="preserve"/>
-            </w:r>
-          </w:p>
-        </w:tc>
-        <w:tc>
-          <w:tcPr>
-            <w:tcBorders>
-              <w:bottom w:val="none" w:sz="0" w:space="0" w:color="000000"/>
-              <w:top w:val="single" w:sz="4" w:space="0" w:color="999999"/>
-              <w:left w:val="none" w:sz="0" w:space="0" w:color="000000"/>
-              <w:right w:val="none" w:sz="0" w:space="0" w:color="000000"/>
-            </w:tcBorders>
-            <w:shd w:val="clear" w:color="auto" w:fill="FFFFFF"/>
-            <w:tcMar>
-              <w:top w:w="0" w:type="dxa"/>
-              <w:bottom w:w="0" w:type="dxa"/>
-              <w:left w:w="0" w:type="dxa"/>
-              <w:right w:w="0" w:type="dxa"/>
-            </w:tcMar>
-            <w:vAlign w:val="center"/>
-          </w:tcPr>
-          <w:p>
-            <w:pPr>
-              <w:pStyle w:val="Normal"/>
-              <w:jc w:val="center"/>
-              <w:pBdr>
-                <w:bottom w:val="none" w:sz="0" w:space="0" w:color="000000"/>
-                <w:top w:val="none" w:sz="0" w:space="0" w:color="000000"/>
-                <w:left w:val="none" w:sz="0" w:space="0" w:color="000000"/>
-                <w:right w:val="none" w:sz="0" w:space="0" w:color="000000"/>
-              </w:pBdr>
-              <w:spacing w:after="40" w:before="40" w:line="240"/>
-              <w:ind w:left="100" w:right="100" w:firstLine="0" w:firstLineChars="0"/>
-              <w:rPr>
-                <w:rFonts w:ascii="Times New Roman" w:hAnsi="Times New Roman" w:eastAsia="Times New Roman" w:cs="Times New Roman"/>
-                <w:i w:val="false"/>
-                <w:b w:val="true"/>
-                <w:u w:val="none"/>
-                <w:strike w:val="false"/>
-                <w:sz w:val="20"/>
-                <w:szCs w:val="20"/>
-                <w:color w:val="000000"/>
-              </w:rPr>
-            </w:pPr>
-            <w:r>
-              <w:rPr>
-                <w:rFonts w:ascii="Times New Roman" w:hAnsi="Times New Roman" w:eastAsia="Times New Roman" w:cs="Times New Roman"/>
-                <w:i w:val="false"/>
-                <w:b w:val="true"/>
-                <w:u w:val="none"/>
-                <w:strike w:val="false"/>
-                <w:sz w:val="20"/>
-                <w:szCs w:val="20"/>
-                <w:color w:val="000000"/>
-              </w:rPr>
-              <w:t xml:space="preserve"/>
-            </w:r>
-          </w:p>
-        </w:tc>
-      </w:tr>
-      <w:tr>
-        <w:trPr>
-          <w:trHeight w:val="360" w:hRule="auto"/>
-        </w:trPr>
-        <w:tc>
-          <w:tcPr>
-            <w:tcBorders>
-              <w:bottom w:val="none" w:sz="0" w:space="0" w:color="000000"/>
-              <w:top w:val="none" w:sz="0" w:space="0" w:color="000000"/>
-              <w:left w:val="none" w:sz="0" w:space="0" w:color="000000"/>
-              <w:right w:val="none" w:sz="0" w:space="0" w:color="000000"/>
-            </w:tcBorders>
-            <w:shd w:val="clear" w:color="auto" w:fill="FFFFFF"/>
-            <w:tcMar>
-              <w:top w:w="0" w:type="dxa"/>
-              <w:bottom w:w="0" w:type="dxa"/>
-              <w:left w:w="0" w:type="dxa"/>
-              <w:right w:w="0" w:type="dxa"/>
-            </w:tcMar>
-            <w:vAlign w:val="center"/>
-          </w:tcPr>
-          <w:p>
-            <w:pPr>
-              <w:pStyle w:val="Normal"/>
-              <w:jc w:val="left"/>
-              <w:pBdr>
-                <w:bottom w:val="none" w:sz="0" w:space="0" w:color="000000"/>
-                <w:top w:val="none" w:sz="0" w:space="0" w:color="000000"/>
-                <w:left w:val="none" w:sz="0" w:space="0" w:color="000000"/>
-                <w:right w:val="none" w:sz="0" w:space="0" w:color="000000"/>
-              </w:pBdr>
-              <w:spacing w:after="40" w:before="40" w:line="240"/>
-              <w:ind w:left="100" w:right="100" w:firstLine="0" w:firstLineChars="0"/>
-              <w:rPr>
-                <w:rFonts w:ascii="Times New Roman" w:hAnsi="Times New Roman" w:eastAsia="Times New Roman" w:cs="Times New Roman"/>
-                <w:i w:val="true"/>
-                <w:b w:val="false"/>
-                <w:u w:val="none"/>
-                <w:strike w:val="false"/>
-                <w:sz w:val="20"/>
-                <w:szCs w:val="20"/>
-                <w:color w:val="000000"/>
-              </w:rPr>
-            </w:pPr>
-            <w:r>
-              <w:rPr>
-                <w:rFonts w:ascii="Times New Roman" w:hAnsi="Times New Roman" w:eastAsia="Times New Roman" w:cs="Times New Roman"/>
-                <w:i w:val="true"/>
-                <w:b w:val="false"/>
-                <w:u w:val="none"/>
-                <w:strike w:val="false"/>
-                <w:sz w:val="20"/>
-                <w:szCs w:val="20"/>
-                <w:color w:val="000000"/>
-              </w:rPr>
-              <w:t xml:space="preserve">  Mager masse (LBM), g</w:t>
-            </w:r>
-          </w:p>
-        </w:tc>
-        <w:tc>
-          <w:tcPr>
-            <w:tcBorders>
-              <w:bottom w:val="none" w:sz="0" w:space="0" w:color="000000"/>
-              <w:top w:val="none" w:sz="0" w:space="0" w:color="000000"/>
-              <w:left w:val="none" w:sz="0" w:space="0" w:color="000000"/>
-              <w:right w:val="none" w:sz="0" w:space="0" w:color="000000"/>
-            </w:tcBorders>
-            <w:shd w:val="clear" w:color="auto" w:fill="FFFFFF"/>
-            <w:tcMar>
-              <w:top w:w="0" w:type="dxa"/>
-              <w:bottom w:w="0" w:type="dxa"/>
-              <w:left w:w="0" w:type="dxa"/>
-              <w:right w:w="0" w:type="dxa"/>
-            </w:tcMar>
-            <w:vAlign w:val="center"/>
-          </w:tcPr>
-          <w:p>
-            <w:pPr>
-              <w:pStyle w:val="Normal"/>
-              <w:jc w:val="center"/>
-              <w:pBdr>
-                <w:bottom w:val="none" w:sz="0" w:space="0" w:color="000000"/>
-                <w:top w:val="none" w:sz="0" w:space="0" w:color="000000"/>
-                <w:left w:val="none" w:sz="0" w:space="0" w:color="000000"/>
-                <w:right w:val="none" w:sz="0" w:space="0" w:color="000000"/>
-              </w:pBdr>
-              <w:spacing w:after="40" w:before="40" w:line="240"/>
-              <w:ind w:left="100" w:right="100" w:firstLine="0" w:firstLineChars="0"/>
-              <w:rPr>
-                <w:rFonts w:ascii="Times New Roman" w:hAnsi="Times New Roman" w:eastAsia="Times New Roman" w:cs="Times New Roman"/>
-                <w:i w:val="false"/>
-                <w:b w:val="false"/>
-                <w:u w:val="none"/>
-                <w:strike w:val="false"/>
-                <w:sz w:val="20"/>
-                <w:szCs w:val="20"/>
-                <w:color w:val="000000"/>
-              </w:rPr>
-            </w:pPr>
-            <w:r>
-              <w:rPr>
-                <w:rFonts w:ascii="Times New Roman" w:hAnsi="Times New Roman" w:eastAsia="Times New Roman" w:cs="Times New Roman"/>
-                <w:i w:val="false"/>
-                <w:b w:val="false"/>
-                <w:u w:val="none"/>
-                <w:strike w:val="false"/>
-                <w:sz w:val="20"/>
-                <w:szCs w:val="20"/>
-                <w:color w:val="000000"/>
-              </w:rPr>
-              <w:t xml:space="preserve">47749 (8047)</w:t>
-            </w:r>
-          </w:p>
-        </w:tc>
-        <w:tc>
-          <w:tcPr>
-            <w:tcBorders>
-              <w:bottom w:val="none" w:sz="0" w:space="0" w:color="000000"/>
-              <w:top w:val="none" w:sz="0" w:space="0" w:color="000000"/>
-              <w:left w:val="none" w:sz="0" w:space="0" w:color="000000"/>
-              <w:right w:val="none" w:sz="0" w:space="0" w:color="000000"/>
-            </w:tcBorders>
-            <w:shd w:val="clear" w:color="auto" w:fill="FFFFFF"/>
-            <w:tcMar>
-              <w:top w:w="0" w:type="dxa"/>
-              <w:bottom w:w="0" w:type="dxa"/>
-              <w:left w:w="0" w:type="dxa"/>
-              <w:right w:w="0" w:type="dxa"/>
-            </w:tcMar>
-            <w:vAlign w:val="center"/>
-          </w:tcPr>
-          <w:p>
-            <w:pPr>
-              <w:pStyle w:val="Normal"/>
-              <w:jc w:val="center"/>
-              <w:pBdr>
-                <w:bottom w:val="none" w:sz="0" w:space="0" w:color="000000"/>
-                <w:top w:val="none" w:sz="0" w:space="0" w:color="000000"/>
-                <w:left w:val="none" w:sz="0" w:space="0" w:color="000000"/>
-                <w:right w:val="none" w:sz="0" w:space="0" w:color="000000"/>
-              </w:pBdr>
-              <w:spacing w:after="40" w:before="40" w:line="240"/>
-              <w:ind w:left="100" w:right="100" w:firstLine="0" w:firstLineChars="0"/>
-              <w:rPr>
-                <w:rFonts w:ascii="Times New Roman" w:hAnsi="Times New Roman" w:eastAsia="Times New Roman" w:cs="Times New Roman"/>
-                <w:i w:val="false"/>
-                <w:b w:val="false"/>
-                <w:u w:val="none"/>
-                <w:strike w:val="false"/>
-                <w:sz w:val="20"/>
-                <w:szCs w:val="20"/>
-                <w:color w:val="000000"/>
-              </w:rPr>
-            </w:pPr>
-            <w:r>
-              <w:rPr>
-                <w:rFonts w:ascii="Times New Roman" w:hAnsi="Times New Roman" w:eastAsia="Times New Roman" w:cs="Times New Roman"/>
-                <w:i w:val="false"/>
-                <w:b w:val="false"/>
-                <w:u w:val="none"/>
-                <w:strike w:val="false"/>
-                <w:sz w:val="20"/>
-                <w:szCs w:val="20"/>
-                <w:color w:val="000000"/>
-              </w:rPr>
-              <w:t xml:space="preserve">47550 (9115)</w:t>
-            </w:r>
-          </w:p>
-        </w:tc>
-        <w:tc>
-          <w:tcPr>
-            <w:tcBorders>
-              <w:bottom w:val="none" w:sz="0" w:space="0" w:color="000000"/>
-              <w:top w:val="none" w:sz="0" w:space="0" w:color="000000"/>
-              <w:left w:val="none" w:sz="0" w:space="0" w:color="000000"/>
-              <w:right w:val="none" w:sz="0" w:space="0" w:color="000000"/>
-            </w:tcBorders>
-            <w:shd w:val="clear" w:color="auto" w:fill="FFFFFF"/>
-            <w:tcMar>
-              <w:top w:w="0" w:type="dxa"/>
-              <w:bottom w:w="0" w:type="dxa"/>
-              <w:left w:w="0" w:type="dxa"/>
-              <w:right w:w="0" w:type="dxa"/>
-            </w:tcMar>
-            <w:vAlign w:val="center"/>
-          </w:tcPr>
-          <w:p>
-            <w:pPr>
-              <w:pStyle w:val="Normal"/>
-              <w:jc w:val="center"/>
-              <w:pBdr>
-                <w:bottom w:val="none" w:sz="0" w:space="0" w:color="000000"/>
-                <w:top w:val="none" w:sz="0" w:space="0" w:color="000000"/>
-                <w:left w:val="none" w:sz="0" w:space="0" w:color="000000"/>
-                <w:right w:val="none" w:sz="0" w:space="0" w:color="000000"/>
-              </w:pBdr>
-              <w:spacing w:after="40" w:before="40" w:line="240"/>
-              <w:ind w:left="100" w:right="100" w:firstLine="0" w:firstLineChars="0"/>
-              <w:rPr>
-                <w:rFonts w:ascii="Times New Roman" w:hAnsi="Times New Roman" w:eastAsia="Times New Roman" w:cs="Times New Roman"/>
-                <w:i w:val="false"/>
-                <w:b w:val="false"/>
-                <w:u w:val="none"/>
-                <w:strike w:val="false"/>
-                <w:sz w:val="20"/>
-                <w:szCs w:val="20"/>
-                <w:color w:val="000000"/>
-              </w:rPr>
-            </w:pPr>
-            <w:r>
-              <w:rPr>
-                <w:rFonts w:ascii="Times New Roman" w:hAnsi="Times New Roman" w:eastAsia="Times New Roman" w:cs="Times New Roman"/>
-                <w:i w:val="false"/>
-                <w:b w:val="false"/>
-                <w:u w:val="none"/>
-                <w:strike w:val="false"/>
-                <w:sz w:val="20"/>
-                <w:szCs w:val="20"/>
-                <w:color w:val="000000"/>
-              </w:rPr>
-              <w:t xml:space="preserve">47633 (8598)</w:t>
-            </w:r>
-          </w:p>
-        </w:tc>
-        <w:tc>
-          <w:tcPr>
-            <w:tcBorders>
-              <w:bottom w:val="none" w:sz="0" w:space="0" w:color="000000"/>
-              <w:top w:val="none" w:sz="0" w:space="0" w:color="000000"/>
-              <w:left w:val="none" w:sz="0" w:space="0" w:color="000000"/>
-              <w:right w:val="none" w:sz="0" w:space="0" w:color="000000"/>
-            </w:tcBorders>
-            <w:shd w:val="clear" w:color="auto" w:fill="FFFFFF"/>
-            <w:tcMar>
-              <w:top w:w="0" w:type="dxa"/>
-              <w:bottom w:w="0" w:type="dxa"/>
-              <w:left w:w="0" w:type="dxa"/>
-              <w:right w:w="0" w:type="dxa"/>
-            </w:tcMar>
-            <w:vAlign w:val="center"/>
-          </w:tcPr>
-          <w:p>
-            <w:pPr>
-              <w:pStyle w:val="Normal"/>
-              <w:jc w:val="center"/>
-              <w:pBdr>
-                <w:bottom w:val="none" w:sz="0" w:space="0" w:color="000000"/>
-                <w:top w:val="none" w:sz="0" w:space="0" w:color="000000"/>
-                <w:left w:val="none" w:sz="0" w:space="0" w:color="000000"/>
-                <w:right w:val="none" w:sz="0" w:space="0" w:color="000000"/>
-              </w:pBdr>
-              <w:spacing w:after="40" w:before="40" w:line="240"/>
-              <w:ind w:left="100" w:right="100" w:firstLine="0" w:firstLineChars="0"/>
-              <w:rPr>
-                <w:rFonts w:ascii="Times New Roman" w:hAnsi="Times New Roman" w:eastAsia="Times New Roman" w:cs="Times New Roman"/>
-                <w:i w:val="false"/>
-                <w:b w:val="false"/>
-                <w:u w:val="none"/>
-                <w:strike w:val="false"/>
-                <w:sz w:val="20"/>
-                <w:szCs w:val="20"/>
-                <w:color w:val="000000"/>
-              </w:rPr>
-            </w:pPr>
-            <w:r>
-              <w:rPr>
-                <w:rFonts w:ascii="Times New Roman" w:hAnsi="Times New Roman" w:eastAsia="Times New Roman" w:cs="Times New Roman"/>
-                <w:i w:val="false"/>
-                <w:b w:val="false"/>
-                <w:u w:val="none"/>
-                <w:strike w:val="false"/>
-                <w:sz w:val="20"/>
-                <w:szCs w:val="20"/>
-                <w:color w:val="000000"/>
-              </w:rPr>
-              <w:t xml:space="preserve">0.844</w:t>
-            </w:r>
-          </w:p>
-        </w:tc>
-      </w:tr>
-      <w:tr>
-        <w:trPr>
-          <w:trHeight w:val="360" w:hRule="auto"/>
-        </w:trPr>
-        <w:tc>
-          <w:tcPr>
-            <w:tcBorders>
-              <w:bottom w:val="none" w:sz="0" w:space="0" w:color="000000"/>
-              <w:top w:val="none" w:sz="0" w:space="0" w:color="000000"/>
-              <w:left w:val="none" w:sz="0" w:space="0" w:color="000000"/>
-              <w:right w:val="none" w:sz="0" w:space="0" w:color="000000"/>
-            </w:tcBorders>
-            <w:shd w:val="clear" w:color="auto" w:fill="FFFFFF"/>
-            <w:tcMar>
-              <w:top w:w="0" w:type="dxa"/>
-              <w:bottom w:w="0" w:type="dxa"/>
-              <w:left w:w="0" w:type="dxa"/>
-              <w:right w:w="0" w:type="dxa"/>
-            </w:tcMar>
-            <w:vAlign w:val="center"/>
-          </w:tcPr>
-          <w:p>
-            <w:pPr>
-              <w:pStyle w:val="Normal"/>
-              <w:jc w:val="left"/>
-              <w:pBdr>
-                <w:bottom w:val="none" w:sz="0" w:space="0" w:color="000000"/>
-                <w:top w:val="none" w:sz="0" w:space="0" w:color="000000"/>
-                <w:left w:val="none" w:sz="0" w:space="0" w:color="000000"/>
-                <w:right w:val="none" w:sz="0" w:space="0" w:color="000000"/>
-              </w:pBdr>
-              <w:spacing w:after="40" w:before="40" w:line="240"/>
-              <w:ind w:left="100" w:right="100" w:firstLine="0" w:firstLineChars="0"/>
-              <w:rPr>
-                <w:rFonts w:ascii="Times New Roman" w:hAnsi="Times New Roman" w:eastAsia="Times New Roman" w:cs="Times New Roman"/>
-                <w:i w:val="true"/>
-                <w:b w:val="false"/>
-                <w:u w:val="none"/>
-                <w:strike w:val="false"/>
-                <w:sz w:val="20"/>
-                <w:szCs w:val="20"/>
-                <w:color w:val="000000"/>
-              </w:rPr>
-            </w:pPr>
-            <w:r>
-              <w:rPr>
-                <w:rFonts w:ascii="Times New Roman" w:hAnsi="Times New Roman" w:eastAsia="Times New Roman" w:cs="Times New Roman"/>
-                <w:i w:val="true"/>
-                <w:b w:val="false"/>
-                <w:u w:val="none"/>
-                <w:strike w:val="false"/>
-                <w:sz w:val="20"/>
-                <w:szCs w:val="20"/>
-                <w:color w:val="000000"/>
-              </w:rPr>
-              <w:t xml:space="preserve">  Total fettmasse, g</w:t>
-            </w:r>
-          </w:p>
-        </w:tc>
-        <w:tc>
-          <w:tcPr>
-            <w:tcBorders>
-              <w:bottom w:val="none" w:sz="0" w:space="0" w:color="000000"/>
-              <w:top w:val="none" w:sz="0" w:space="0" w:color="000000"/>
-              <w:left w:val="none" w:sz="0" w:space="0" w:color="000000"/>
-              <w:right w:val="none" w:sz="0" w:space="0" w:color="000000"/>
-            </w:tcBorders>
-            <w:shd w:val="clear" w:color="auto" w:fill="FFFFFF"/>
-            <w:tcMar>
-              <w:top w:w="0" w:type="dxa"/>
-              <w:bottom w:w="0" w:type="dxa"/>
-              <w:left w:w="0" w:type="dxa"/>
-              <w:right w:w="0" w:type="dxa"/>
-            </w:tcMar>
-            <w:vAlign w:val="center"/>
-          </w:tcPr>
-          <w:p>
-            <w:pPr>
-              <w:pStyle w:val="Normal"/>
-              <w:jc w:val="center"/>
-              <w:pBdr>
-                <w:bottom w:val="none" w:sz="0" w:space="0" w:color="000000"/>
-                <w:top w:val="none" w:sz="0" w:space="0" w:color="000000"/>
-                <w:left w:val="none" w:sz="0" w:space="0" w:color="000000"/>
-                <w:right w:val="none" w:sz="0" w:space="0" w:color="000000"/>
-              </w:pBdr>
-              <w:spacing w:after="40" w:before="40" w:line="240"/>
-              <w:ind w:left="100" w:right="100" w:firstLine="0" w:firstLineChars="0"/>
-              <w:rPr>
-                <w:rFonts w:ascii="Times New Roman" w:hAnsi="Times New Roman" w:eastAsia="Times New Roman" w:cs="Times New Roman"/>
-                <w:i w:val="false"/>
-                <w:b w:val="false"/>
-                <w:u w:val="none"/>
-                <w:strike w:val="false"/>
-                <w:sz w:val="20"/>
-                <w:szCs w:val="20"/>
-                <w:color w:val="000000"/>
-              </w:rPr>
-            </w:pPr>
-            <w:r>
-              <w:rPr>
-                <w:rFonts w:ascii="Times New Roman" w:hAnsi="Times New Roman" w:eastAsia="Times New Roman" w:cs="Times New Roman"/>
-                <w:i w:val="false"/>
-                <w:b w:val="false"/>
-                <w:u w:val="none"/>
-                <w:strike w:val="false"/>
-                <w:sz w:val="20"/>
-                <w:szCs w:val="20"/>
-                <w:color w:val="000000"/>
-              </w:rPr>
-              <w:t xml:space="preserve">29271 (8206)</w:t>
-            </w:r>
-          </w:p>
-        </w:tc>
-        <w:tc>
-          <w:tcPr>
-            <w:tcBorders>
-              <w:bottom w:val="none" w:sz="0" w:space="0" w:color="000000"/>
-              <w:top w:val="none" w:sz="0" w:space="0" w:color="000000"/>
-              <w:left w:val="none" w:sz="0" w:space="0" w:color="000000"/>
-              <w:right w:val="none" w:sz="0" w:space="0" w:color="000000"/>
-            </w:tcBorders>
-            <w:shd w:val="clear" w:color="auto" w:fill="FFFFFF"/>
-            <w:tcMar>
-              <w:top w:w="0" w:type="dxa"/>
-              <w:bottom w:w="0" w:type="dxa"/>
-              <w:left w:w="0" w:type="dxa"/>
-              <w:right w:w="0" w:type="dxa"/>
-            </w:tcMar>
-            <w:vAlign w:val="center"/>
-          </w:tcPr>
-          <w:p>
-            <w:pPr>
-              <w:pStyle w:val="Normal"/>
-              <w:jc w:val="center"/>
-              <w:pBdr>
-                <w:bottom w:val="none" w:sz="0" w:space="0" w:color="000000"/>
-                <w:top w:val="none" w:sz="0" w:space="0" w:color="000000"/>
-                <w:left w:val="none" w:sz="0" w:space="0" w:color="000000"/>
-                <w:right w:val="none" w:sz="0" w:space="0" w:color="000000"/>
-              </w:pBdr>
-              <w:spacing w:after="40" w:before="40" w:line="240"/>
-              <w:ind w:left="100" w:right="100" w:firstLine="0" w:firstLineChars="0"/>
-              <w:rPr>
-                <w:rFonts w:ascii="Times New Roman" w:hAnsi="Times New Roman" w:eastAsia="Times New Roman" w:cs="Times New Roman"/>
-                <w:i w:val="false"/>
-                <w:b w:val="false"/>
-                <w:u w:val="none"/>
-                <w:strike w:val="false"/>
-                <w:sz w:val="20"/>
-                <w:szCs w:val="20"/>
-                <w:color w:val="000000"/>
-              </w:rPr>
-            </w:pPr>
-            <w:r>
-              <w:rPr>
-                <w:rFonts w:ascii="Times New Roman" w:hAnsi="Times New Roman" w:eastAsia="Times New Roman" w:cs="Times New Roman"/>
-                <w:i w:val="false"/>
-                <w:b w:val="false"/>
-                <w:u w:val="none"/>
-                <w:strike w:val="false"/>
-                <w:sz w:val="20"/>
-                <w:szCs w:val="20"/>
-                <w:color w:val="000000"/>
-              </w:rPr>
-              <w:t xml:space="preserve">26817 (9611)</w:t>
-            </w:r>
-          </w:p>
-        </w:tc>
-        <w:tc>
-          <w:tcPr>
-            <w:tcBorders>
-              <w:bottom w:val="none" w:sz="0" w:space="0" w:color="000000"/>
-              <w:top w:val="none" w:sz="0" w:space="0" w:color="000000"/>
-              <w:left w:val="none" w:sz="0" w:space="0" w:color="000000"/>
-              <w:right w:val="none" w:sz="0" w:space="0" w:color="000000"/>
-            </w:tcBorders>
-            <w:shd w:val="clear" w:color="auto" w:fill="FFFFFF"/>
-            <w:tcMar>
-              <w:top w:w="0" w:type="dxa"/>
-              <w:bottom w:w="0" w:type="dxa"/>
-              <w:left w:w="0" w:type="dxa"/>
-              <w:right w:w="0" w:type="dxa"/>
-            </w:tcMar>
-            <w:vAlign w:val="center"/>
-          </w:tcPr>
-          <w:p>
-            <w:pPr>
-              <w:pStyle w:val="Normal"/>
-              <w:jc w:val="center"/>
-              <w:pBdr>
-                <w:bottom w:val="none" w:sz="0" w:space="0" w:color="000000"/>
-                <w:top w:val="none" w:sz="0" w:space="0" w:color="000000"/>
-                <w:left w:val="none" w:sz="0" w:space="0" w:color="000000"/>
-                <w:right w:val="none" w:sz="0" w:space="0" w:color="000000"/>
-              </w:pBdr>
-              <w:spacing w:after="40" w:before="40" w:line="240"/>
-              <w:ind w:left="100" w:right="100" w:firstLine="0" w:firstLineChars="0"/>
-              <w:rPr>
-                <w:rFonts w:ascii="Times New Roman" w:hAnsi="Times New Roman" w:eastAsia="Times New Roman" w:cs="Times New Roman"/>
-                <w:i w:val="false"/>
-                <w:b w:val="false"/>
-                <w:u w:val="none"/>
-                <w:strike w:val="false"/>
-                <w:sz w:val="20"/>
-                <w:szCs w:val="20"/>
-                <w:color w:val="000000"/>
-              </w:rPr>
-            </w:pPr>
-            <w:r>
-              <w:rPr>
-                <w:rFonts w:ascii="Times New Roman" w:hAnsi="Times New Roman" w:eastAsia="Times New Roman" w:cs="Times New Roman"/>
-                <w:i w:val="false"/>
-                <w:b w:val="false"/>
-                <w:u w:val="none"/>
-                <w:strike w:val="false"/>
-                <w:sz w:val="20"/>
-                <w:szCs w:val="20"/>
-                <w:color w:val="000000"/>
-              </w:rPr>
-              <w:t xml:space="preserve">27847 (9043)</w:t>
-            </w:r>
-          </w:p>
-        </w:tc>
-        <w:tc>
-          <w:tcPr>
-            <w:tcBorders>
-              <w:bottom w:val="none" w:sz="0" w:space="0" w:color="000000"/>
-              <w:top w:val="none" w:sz="0" w:space="0" w:color="000000"/>
-              <w:left w:val="none" w:sz="0" w:space="0" w:color="000000"/>
-              <w:right w:val="none" w:sz="0" w:space="0" w:color="000000"/>
-            </w:tcBorders>
-            <w:shd w:val="clear" w:color="auto" w:fill="FFFFFF"/>
-            <w:tcMar>
-              <w:top w:w="0" w:type="dxa"/>
-              <w:bottom w:w="0" w:type="dxa"/>
-              <w:left w:w="0" w:type="dxa"/>
-              <w:right w:w="0" w:type="dxa"/>
-            </w:tcMar>
-            <w:vAlign w:val="center"/>
-          </w:tcPr>
-          <w:p>
-            <w:pPr>
-              <w:pStyle w:val="Normal"/>
-              <w:jc w:val="center"/>
-              <w:pBdr>
-                <w:bottom w:val="none" w:sz="0" w:space="0" w:color="000000"/>
-                <w:top w:val="none" w:sz="0" w:space="0" w:color="000000"/>
-                <w:left w:val="none" w:sz="0" w:space="0" w:color="000000"/>
-                <w:right w:val="none" w:sz="0" w:space="0" w:color="000000"/>
-              </w:pBdr>
-              <w:spacing w:after="40" w:before="40" w:line="240"/>
-              <w:ind w:left="100" w:right="100" w:firstLine="0" w:firstLineChars="0"/>
-              <w:rPr>
-                <w:rFonts w:ascii="Times New Roman" w:hAnsi="Times New Roman" w:eastAsia="Times New Roman" w:cs="Times New Roman"/>
-                <w:i w:val="false"/>
-                <w:b w:val="false"/>
-                <w:u w:val="none"/>
-                <w:strike w:val="false"/>
-                <w:sz w:val="20"/>
-                <w:szCs w:val="20"/>
-                <w:color w:val="000000"/>
-              </w:rPr>
-            </w:pPr>
-            <w:r>
-              <w:rPr>
-                <w:rFonts w:ascii="Times New Roman" w:hAnsi="Times New Roman" w:eastAsia="Times New Roman" w:cs="Times New Roman"/>
-                <w:i w:val="false"/>
-                <w:b w:val="false"/>
-                <w:u w:val="none"/>
-                <w:strike w:val="false"/>
-                <w:sz w:val="20"/>
-                <w:szCs w:val="20"/>
-                <w:color w:val="000000"/>
-              </w:rPr>
-              <w:t xml:space="preserve">0.231</w:t>
-            </w:r>
-          </w:p>
-        </w:tc>
-      </w:tr>
-      <w:tr>
-        <w:trPr>
-          <w:trHeight w:val="360" w:hRule="auto"/>
-        </w:trPr>
-        <w:tc>
-          <w:tcPr>
-            <w:tcBorders>
-              <w:bottom w:val="single" w:sz="8" w:space="0" w:color="000000"/>
-              <w:top w:val="none" w:sz="0" w:space="0" w:color="000000"/>
-              <w:left w:val="none" w:sz="0" w:space="0" w:color="000000"/>
-              <w:right w:val="none" w:sz="0" w:space="0" w:color="000000"/>
-            </w:tcBorders>
-            <w:shd w:val="clear" w:color="auto" w:fill="FFFFFF"/>
-            <w:tcMar>
-              <w:top w:w="0" w:type="dxa"/>
-              <w:bottom w:w="0" w:type="dxa"/>
-              <w:left w:w="0" w:type="dxa"/>
-              <w:right w:w="0" w:type="dxa"/>
-            </w:tcMar>
-            <w:vAlign w:val="center"/>
-          </w:tcPr>
-          <w:p>
-            <w:pPr>
-              <w:pStyle w:val="Normal"/>
-              <w:jc w:val="left"/>
-              <w:pBdr>
-                <w:bottom w:val="none" w:sz="0" w:space="0" w:color="000000"/>
-                <w:top w:val="none" w:sz="0" w:space="0" w:color="000000"/>
-                <w:left w:val="none" w:sz="0" w:space="0" w:color="000000"/>
-                <w:right w:val="none" w:sz="0" w:space="0" w:color="000000"/>
-              </w:pBdr>
-              <w:spacing w:after="200" w:before="40" w:line="240"/>
-              <w:ind w:left="100" w:right="100" w:firstLine="0" w:firstLineChars="0"/>
-              <w:rPr>
-                <w:rFonts w:ascii="Times New Roman" w:hAnsi="Times New Roman" w:eastAsia="Times New Roman" w:cs="Times New Roman"/>
-                <w:i w:val="true"/>
-                <w:b w:val="false"/>
-                <w:u w:val="none"/>
-                <w:strike w:val="false"/>
-                <w:sz w:val="20"/>
-                <w:szCs w:val="20"/>
-                <w:color w:val="000000"/>
-              </w:rPr>
-            </w:pPr>
-            <w:r>
-              <w:rPr>
-                <w:rFonts w:ascii="Times New Roman" w:hAnsi="Times New Roman" w:eastAsia="Times New Roman" w:cs="Times New Roman"/>
-                <w:i w:val="true"/>
-                <w:b w:val="false"/>
-                <w:u w:val="none"/>
-                <w:strike w:val="false"/>
-                <w:sz w:val="20"/>
-                <w:szCs w:val="20"/>
-                <w:color w:val="000000"/>
-              </w:rPr>
-              <w:t xml:space="preserve">  Total fettprosent, %</w:t>
-            </w:r>
-          </w:p>
-        </w:tc>
-        <w:tc>
-          <w:tcPr>
-            <w:tcBorders>
-              <w:bottom w:val="single" w:sz="8" w:space="0" w:color="000000"/>
-              <w:top w:val="none" w:sz="0" w:space="0" w:color="000000"/>
-              <w:left w:val="none" w:sz="0" w:space="0" w:color="000000"/>
-              <w:right w:val="none" w:sz="0" w:space="0" w:color="000000"/>
-            </w:tcBorders>
-            <w:shd w:val="clear" w:color="auto" w:fill="FFFFFF"/>
-            <w:tcMar>
-              <w:top w:w="0" w:type="dxa"/>
-              <w:bottom w:w="0" w:type="dxa"/>
-              <w:left w:w="0" w:type="dxa"/>
-              <w:right w:w="0" w:type="dxa"/>
-            </w:tcMar>
-            <w:vAlign w:val="center"/>
-          </w:tcPr>
-          <w:p>
-            <w:pPr>
-              <w:pStyle w:val="Normal"/>
-              <w:jc w:val="center"/>
-              <w:pBdr>
-                <w:bottom w:val="none" w:sz="0" w:space="0" w:color="000000"/>
-                <w:top w:val="none" w:sz="0" w:space="0" w:color="000000"/>
-                <w:left w:val="none" w:sz="0" w:space="0" w:color="000000"/>
-                <w:right w:val="none" w:sz="0" w:space="0" w:color="000000"/>
-              </w:pBdr>
-              <w:spacing w:after="200" w:before="40" w:line="240"/>
-              <w:ind w:left="100" w:right="100" w:firstLine="0" w:firstLineChars="0"/>
-              <w:rPr>
-                <w:rFonts w:ascii="Times New Roman" w:hAnsi="Times New Roman" w:eastAsia="Times New Roman" w:cs="Times New Roman"/>
-                <w:i w:val="false"/>
-                <w:b w:val="false"/>
-                <w:u w:val="none"/>
-                <w:strike w:val="false"/>
-                <w:sz w:val="20"/>
-                <w:szCs w:val="20"/>
-                <w:color w:val="000000"/>
-              </w:rPr>
-            </w:pPr>
-            <w:r>
-              <w:rPr>
-                <w:rFonts w:ascii="Times New Roman" w:hAnsi="Times New Roman" w:eastAsia="Times New Roman" w:cs="Times New Roman"/>
-                <w:i w:val="false"/>
-                <w:b w:val="false"/>
-                <w:u w:val="none"/>
-                <w:strike w:val="false"/>
-                <w:sz w:val="20"/>
-                <w:szCs w:val="20"/>
-                <w:color w:val="000000"/>
-              </w:rPr>
-              <w:t xml:space="preserve">37.8 (8.2)</w:t>
-            </w:r>
-          </w:p>
-        </w:tc>
-        <w:tc>
-          <w:tcPr>
-            <w:tcBorders>
-              <w:bottom w:val="single" w:sz="8" w:space="0" w:color="000000"/>
-              <w:top w:val="none" w:sz="0" w:space="0" w:color="000000"/>
-              <w:left w:val="none" w:sz="0" w:space="0" w:color="000000"/>
-              <w:right w:val="none" w:sz="0" w:space="0" w:color="000000"/>
-            </w:tcBorders>
-            <w:shd w:val="clear" w:color="auto" w:fill="FFFFFF"/>
-            <w:tcMar>
-              <w:top w:w="0" w:type="dxa"/>
-              <w:bottom w:w="0" w:type="dxa"/>
-              <w:left w:w="0" w:type="dxa"/>
-              <w:right w:w="0" w:type="dxa"/>
-            </w:tcMar>
-            <w:vAlign w:val="center"/>
-          </w:tcPr>
-          <w:p>
-            <w:pPr>
-              <w:pStyle w:val="Normal"/>
-              <w:jc w:val="center"/>
-              <w:pBdr>
-                <w:bottom w:val="none" w:sz="0" w:space="0" w:color="000000"/>
-                <w:top w:val="none" w:sz="0" w:space="0" w:color="000000"/>
-                <w:left w:val="none" w:sz="0" w:space="0" w:color="000000"/>
-                <w:right w:val="none" w:sz="0" w:space="0" w:color="000000"/>
-              </w:pBdr>
-              <w:spacing w:after="200" w:before="40" w:line="240"/>
-              <w:ind w:left="100" w:right="100" w:firstLine="0" w:firstLineChars="0"/>
-              <w:rPr>
-                <w:rFonts w:ascii="Times New Roman" w:hAnsi="Times New Roman" w:eastAsia="Times New Roman" w:cs="Times New Roman"/>
-                <w:i w:val="false"/>
-                <w:b w:val="false"/>
-                <w:u w:val="none"/>
-                <w:strike w:val="false"/>
-                <w:sz w:val="20"/>
-                <w:szCs w:val="20"/>
-                <w:color w:val="000000"/>
-              </w:rPr>
-            </w:pPr>
-            <w:r>
-              <w:rPr>
-                <w:rFonts w:ascii="Times New Roman" w:hAnsi="Times New Roman" w:eastAsia="Times New Roman" w:cs="Times New Roman"/>
-                <w:i w:val="false"/>
-                <w:b w:val="false"/>
-                <w:u w:val="none"/>
-                <w:strike w:val="false"/>
-                <w:sz w:val="20"/>
-                <w:szCs w:val="20"/>
-                <w:color w:val="000000"/>
-              </w:rPr>
-              <w:t xml:space="preserve">35.4 (8.0)</w:t>
-            </w:r>
-          </w:p>
-        </w:tc>
-        <w:tc>
-          <w:tcPr>
-            <w:tcBorders>
-              <w:bottom w:val="single" w:sz="8" w:space="0" w:color="000000"/>
-              <w:top w:val="none" w:sz="0" w:space="0" w:color="000000"/>
-              <w:left w:val="none" w:sz="0" w:space="0" w:color="000000"/>
-              <w:right w:val="none" w:sz="0" w:space="0" w:color="000000"/>
-            </w:tcBorders>
-            <w:shd w:val="clear" w:color="auto" w:fill="FFFFFF"/>
-            <w:tcMar>
-              <w:top w:w="0" w:type="dxa"/>
-              <w:bottom w:w="0" w:type="dxa"/>
-              <w:left w:w="0" w:type="dxa"/>
-              <w:right w:w="0" w:type="dxa"/>
-            </w:tcMar>
-            <w:vAlign w:val="center"/>
-          </w:tcPr>
-          <w:p>
-            <w:pPr>
-              <w:pStyle w:val="Normal"/>
-              <w:jc w:val="center"/>
-              <w:pBdr>
-                <w:bottom w:val="none" w:sz="0" w:space="0" w:color="000000"/>
-                <w:top w:val="none" w:sz="0" w:space="0" w:color="000000"/>
-                <w:left w:val="none" w:sz="0" w:space="0" w:color="000000"/>
-                <w:right w:val="none" w:sz="0" w:space="0" w:color="000000"/>
-              </w:pBdr>
-              <w:spacing w:after="200" w:before="40" w:line="240"/>
-              <w:ind w:left="100" w:right="100" w:firstLine="0" w:firstLineChars="0"/>
-              <w:rPr>
-                <w:rFonts w:ascii="Times New Roman" w:hAnsi="Times New Roman" w:eastAsia="Times New Roman" w:cs="Times New Roman"/>
-                <w:i w:val="false"/>
-                <w:b w:val="false"/>
-                <w:u w:val="none"/>
-                <w:strike w:val="false"/>
-                <w:sz w:val="20"/>
-                <w:szCs w:val="20"/>
-                <w:color w:val="000000"/>
-              </w:rPr>
-            </w:pPr>
-            <w:r>
-              <w:rPr>
-                <w:rFonts w:ascii="Times New Roman" w:hAnsi="Times New Roman" w:eastAsia="Times New Roman" w:cs="Times New Roman"/>
-                <w:i w:val="false"/>
-                <w:b w:val="false"/>
-                <w:u w:val="none"/>
-                <w:strike w:val="false"/>
-                <w:sz w:val="20"/>
-                <w:szCs w:val="20"/>
-                <w:color w:val="000000"/>
-              </w:rPr>
-              <w:t xml:space="preserve">36.4 (8.1)</w:t>
-            </w:r>
-          </w:p>
-        </w:tc>
-        <w:tc>
-          <w:tcPr>
-            <w:tcBorders>
-              <w:bottom w:val="single" w:sz="8" w:space="0" w:color="000000"/>
-              <w:top w:val="none" w:sz="0" w:space="0" w:color="000000"/>
-              <w:left w:val="none" w:sz="0" w:space="0" w:color="000000"/>
-              <w:right w:val="none" w:sz="0" w:space="0" w:color="000000"/>
-            </w:tcBorders>
-            <w:shd w:val="clear" w:color="auto" w:fill="FFFFFF"/>
-            <w:tcMar>
-              <w:top w:w="0" w:type="dxa"/>
-              <w:bottom w:w="0" w:type="dxa"/>
-              <w:left w:w="0" w:type="dxa"/>
-              <w:right w:w="0" w:type="dxa"/>
-            </w:tcMar>
-            <w:vAlign w:val="center"/>
-          </w:tcPr>
-          <w:p>
-            <w:pPr>
-              <w:pStyle w:val="Normal"/>
-              <w:jc w:val="center"/>
-              <w:pBdr>
-                <w:bottom w:val="none" w:sz="0" w:space="0" w:color="000000"/>
-                <w:top w:val="none" w:sz="0" w:space="0" w:color="000000"/>
-                <w:left w:val="none" w:sz="0" w:space="0" w:color="000000"/>
-                <w:right w:val="none" w:sz="0" w:space="0" w:color="000000"/>
-              </w:pBdr>
-              <w:spacing w:after="200" w:before="40" w:line="240"/>
-              <w:ind w:left="100" w:right="100" w:firstLine="0" w:firstLineChars="0"/>
-              <w:rPr>
-                <w:rFonts w:ascii="Times New Roman" w:hAnsi="Times New Roman" w:eastAsia="Times New Roman" w:cs="Times New Roman"/>
-                <w:i w:val="false"/>
-                <w:b w:val="false"/>
-                <w:u w:val="none"/>
-                <w:strike w:val="false"/>
-                <w:sz w:val="20"/>
-                <w:szCs w:val="20"/>
-                <w:color w:val="000000"/>
-              </w:rPr>
-            </w:pPr>
-            <w:r>
-              <w:rPr>
-                <w:rFonts w:ascii="Times New Roman" w:hAnsi="Times New Roman" w:eastAsia="Times New Roman" w:cs="Times New Roman"/>
-                <w:i w:val="false"/>
-                <w:b w:val="false"/>
-                <w:u w:val="none"/>
-                <w:strike w:val="false"/>
-                <w:sz w:val="20"/>
-                <w:szCs w:val="20"/>
-                <w:color w:val="000000"/>
-              </w:rPr>
-              <w:t xml:space="preserve">0.350</w:t>
             </w:r>
           </w:p>
         </w:tc>
@@ -12184,7 +11064,7 @@
           <w:szCs w:val="16"/>
           <w:color w:val="000000"/>
         </w:rPr>
-        <w:t xml:space="preserve">¹ Kategoriene er ikke gjensidig utelukkende; en deltaker kan ha mottatt flere behandlingstyper. SD = standardavvik; LBM = lean body mass (mager kroppsmasse). For n = 14 deltakere der kroppen oversteg måleområdet til DXA-maskinen, ble offset-scanning benyttet med programvareestimert venstreside, i tråd med International Society for Clinical Densitometry (ISCD, 2023). P-verdier for kategoriske variabler er beregnet med Fisher’s eksakte test; for kontinuerlige variabler er Wilcoxon rank-sum test benyttet.</w:t>
+        <w:t xml:space="preserve">¹ Kategoriene er ikke gjensidig utelukkende; en deltaker kan ha mottatt flere behandlingstyper. SD = standardavvik. P-verdier for kategoriske variabler er beregnet med Fisher’s eksakte test; for kontinuerlige variabler er Wilcoxon rank-sum test benyttet.</w:t>
       </w:r>
     </w:p>
     <w:sectPr>

</xml_diff>

<commit_message>
Add footnote for missing FP27 pre-anthropometry (n=69)
Co-Authored-By: Claude Sonnet 4.6 <noreply@anthropic.com>
</commit_message>
<xml_diff>
--- a/output/tables/tabell4_baseline.docx
+++ b/output/tables/tabell4_baseline.docx
@@ -2635,7 +2635,7 @@
                 <w:szCs w:val="20"/>
                 <w:color w:val="000000"/>
               </w:rPr>
-              <w:t xml:space="preserve">0.481</w:t>
+              <w:t xml:space="preserve">0.478</w:t>
             </w:r>
           </w:p>
         </w:tc>
@@ -9695,7 +9695,7 @@
                 <w:szCs w:val="20"/>
                 <w:color w:val="000000"/>
               </w:rPr>
-              <w:t xml:space="preserve">Antropometri (pre), gj.snitt (SD)</w:t>
+              <w:t xml:space="preserve">Antropometri (pre), gj.snitt (SD)²</w:t>
             </w:r>
           </w:p>
         </w:tc>
@@ -11064,7 +11064,7 @@
           <w:szCs w:val="16"/>
           <w:color w:val="000000"/>
         </w:rPr>
-        <w:t xml:space="preserve">¹ Kategoriene er ikke gjensidig utelukkende; en deltaker kan ha mottatt flere behandlingstyper. SD = standardavvik. P-verdier for kategoriske variabler er beregnet med Fisher’s eksakte test; for kontinuerlige variabler er Wilcoxon rank-sum test benyttet.</w:t>
+        <w:t xml:space="preserve">¹ Kategoriene er ikke gjensidig utelukkende; en deltaker kan ha mottatt flere behandlingstyper. SD = standardavvik. P-verdier for kategoriske variabler er beregnet med Fisher’s eksakte test; for kontinuerlige variabler er Wilcoxon rank-sum test benyttet. ² Antropometri ved pre-test mangler for én deltaker (FP 27); n = 69 for disse radene.</w:t>
       </w:r>
     </w:p>
     <w:sectPr>

</xml_diff>

<commit_message>
Remove FP number from anthropometry footnote
Co-Authored-By: Claude Sonnet 4.6 <noreply@anthropic.com>
</commit_message>
<xml_diff>
--- a/output/tables/tabell4_baseline.docx
+++ b/output/tables/tabell4_baseline.docx
@@ -1235,7 +1235,7 @@
                 <w:szCs w:val="20"/>
                 <w:color w:val="000000"/>
               </w:rPr>
-              <w:t xml:space="preserve">0.043</w:t>
+              <w:t xml:space="preserve">0.039</w:t>
             </w:r>
           </w:p>
         </w:tc>
@@ -2635,7 +2635,7 @@
                 <w:szCs w:val="20"/>
                 <w:color w:val="000000"/>
               </w:rPr>
-              <w:t xml:space="preserve">0.478</w:t>
+              <w:t xml:space="preserve">0.492</w:t>
             </w:r>
           </w:p>
         </w:tc>
@@ -11064,7 +11064,7 @@
           <w:szCs w:val="16"/>
           <w:color w:val="000000"/>
         </w:rPr>
-        <w:t xml:space="preserve">¹ Kategoriene er ikke gjensidig utelukkende; en deltaker kan ha mottatt flere behandlingstyper. SD = standardavvik. P-verdier for kategoriske variabler er beregnet med Fisher’s eksakte test; for kontinuerlige variabler er Wilcoxon rank-sum test benyttet. ² Antropometri ved pre-test mangler for én deltaker (FP 27); n = 69 for disse radene.</w:t>
+        <w:t xml:space="preserve">¹ Kategoriene er ikke gjensidig utelukkende; en deltaker kan ha mottatt flere behandlingstyper. SD = standardavvik. P-verdier for kategoriske variabler er beregnet med Fisher’s eksakte test; for kontinuerlige variabler er Wilcoxon rank-sum test benyttet. ² Antropometri ved pre-test mangler for én deltaker; n = 69 for disse radene.</w:t>
       </w:r>
     </w:p>
     <w:sectPr>

</xml_diff>

<commit_message>
Revert adherence table to n=50 (completers only)
Co-Authored-By: Claude Sonnet 4.6 <noreply@anthropic.com>
</commit_message>
<xml_diff>
--- a/output/tables/tabell4_baseline.docx
+++ b/output/tables/tabell4_baseline.docx
@@ -1235,7 +1235,7 @@
                 <w:szCs w:val="20"/>
                 <w:color w:val="000000"/>
               </w:rPr>
-              <w:t xml:space="preserve">0.039</w:t>
+              <w:t xml:space="preserve">0.043</w:t>
             </w:r>
           </w:p>
         </w:tc>
@@ -2635,7 +2635,7 @@
                 <w:szCs w:val="20"/>
                 <w:color w:val="000000"/>
               </w:rPr>
-              <w:t xml:space="preserve">0.492</w:t>
+              <w:t xml:space="preserve">0.478</w:t>
             </w:r>
           </w:p>
         </w:tc>

</xml_diff>

<commit_message>
Add descriptive tabelltekst to etterlevelse table per supervisor feedback
Co-Authored-By: Claude Sonnet 4.6 <noreply@anthropic.com>
</commit_message>
<xml_diff>
--- a/output/tables/tabell4_baseline.docx
+++ b/output/tables/tabell4_baseline.docx
@@ -1235,7 +1235,7 @@
                 <w:szCs w:val="20"/>
                 <w:color w:val="000000"/>
               </w:rPr>
-              <w:t xml:space="preserve">0.043</w:t>
+              <w:t xml:space="preserve">0.037</w:t>
             </w:r>
           </w:p>
         </w:tc>
@@ -2635,7 +2635,7 @@
                 <w:szCs w:val="20"/>
                 <w:color w:val="000000"/>
               </w:rPr>
-              <w:t xml:space="preserve">0.478</w:t>
+              <w:t xml:space="preserve">0.489</w:t>
             </w:r>
           </w:p>
         </w:tc>

</xml_diff>

<commit_message>
Oppdater alder-IQR, konsistent IQR-format og figuretiketter
- Legg til IQR for alder per gruppe (digital 52–68, stedlig 58–72, totalt 53–71),
  oppgitt av stipendiat tilknyttet REACT-prosjektet; fotnote ⁴ lagt til i tabell 4
- Endre alle «median (25.–75. persentil)»-etiketter til «median (IQR)»
  i tabell 4 (dager siden behandling) og tabell 5 (etterlevelse)
- Endre «Mager masse (LBM)» til «LBM» i ekvivalensplot (figur 2) og boksplot (figur 3)
- Legg til kommentar i 05_figurer.R om hvorfor ANCOVA-verdier er hardkodet

Co-Authored-By: Claude Sonnet 4.6 <noreply@anthropic.com>
</commit_message>
<xml_diff>
--- a/output/tables/tabell4_baseline.docx
+++ b/output/tables/tabell4_baseline.docx
@@ -2415,7 +2415,7 @@
                 <w:szCs w:val="20"/>
                 <w:color w:val="000000"/>
               </w:rPr>
-              <w:t xml:space="preserve">Alder, år — median</w:t>
+              <w:t xml:space="preserve">Alder, år — median (IQR)⁴</w:t>
             </w:r>
           </w:p>
         </w:tc>
@@ -2470,7 +2470,7 @@
                 <w:szCs w:val="20"/>
                 <w:color w:val="000000"/>
               </w:rPr>
-              <w:t xml:space="preserve">56</w:t>
+              <w:t xml:space="preserve">56 (52–68)</w:t>
             </w:r>
           </w:p>
         </w:tc>
@@ -2525,7 +2525,7 @@
                 <w:szCs w:val="20"/>
                 <w:color w:val="000000"/>
               </w:rPr>
-              <w:t xml:space="preserve">65</w:t>
+              <w:t xml:space="preserve">65 (58–72)</w:t>
             </w:r>
           </w:p>
         </w:tc>
@@ -2580,7 +2580,7 @@
                 <w:szCs w:val="20"/>
                 <w:color w:val="000000"/>
               </w:rPr>
-              <w:t xml:space="preserve">63</w:t>
+              <w:t xml:space="preserve">63 (53–71)</w:t>
             </w:r>
           </w:p>
         </w:tc>
@@ -9695,7 +9695,7 @@
                 <w:szCs w:val="20"/>
                 <w:color w:val="000000"/>
               </w:rPr>
-              <w:t xml:space="preserve">Dager siden siste behandling, median (25.–75. persentil)³</w:t>
+              <w:t xml:space="preserve">Dager siden siste behandling, median (IQR)³</w:t>
             </w:r>
           </w:p>
         </w:tc>
@@ -11344,7 +11344,7 @@
           <w:szCs w:val="16"/>
           <w:color w:val="000000"/>
         </w:rPr>
-        <w:t xml:space="preserve">¹ Kategoriene er ikke gjensidig utelukkende; en deltaker kan ha mottatt flere behandlingstyper. SD = standardavvik. P-verdier for kategoriske variabler er beregnet med Fisher’s eksakte test; for kontinuerlige variabler er Wilcoxon rank-sum test benyttet. ² Antropometri ved pre-test mangler for én deltaker; n = 69 for disse radene. ³ Dager siden siste behandling mangler for 11 deltakere grunnet manglende data; n = 59 for denne raden.</w:t>
+        <w:t xml:space="preserve">¹ Kategoriene er ikke gjensidig utelukkende; en deltaker kan ha mottatt flere behandlingstyper. SD = standardavvik. P-verdier for kategoriske variabler er beregnet med Fisher’s eksakte test; for kontinuerlige variabler er Wilcoxon rank-sum test benyttet. ² Antropometri ved pre-test mangler for én deltaker; n = 69 for disse radene. ³ Dager siden siste behandling mangler for 11 deltakere grunnet manglende data; n = 59 for denne raden. ⁴ Alder (median og IQR) er oppgitt av stipendiat tilknyttet REACT-prosjektet og er ikke beregnet direkte fra rådata i dette skriptet.</w:t>
       </w:r>
     </w:p>
     <w:sectPr>

</xml_diff>